<commit_message>
V1.2.0 cập nhật cấu hình màu sắc
</commit_message>
<xml_diff>
--- a/HUONG_DAN_SU_DUNG.docx
+++ b/HUONG_DAN_SU_DUNG.docx
@@ -7,17 +7,12 @@
         <w:pStyle w:val="Title"/>
       </w:pPr>
       <w:r>
-        <w:t>Hướng dẫn sử dụng Salon Manager</w:t>
+        <w:t>Hướng dẫn Salon Manager</w:t>
       </w:r>
     </w:p>
     <w:p>
       <w:r>
-        <w:t>Phiên bản 1.1.0</w:t>
-      </w:r>
-    </w:p>
-    <w:p>
-      <w:r>
-        <w:t>Tài liệu dành cho chủ salon và thu ngân, hướng dẫn nâng cấp từ v1.0.0 và đối soát tiền theo ca. Dữ liệu cũ được giữ nguyên. Cần kết nối mạng và mở ca trước khi nhận thanh toán mới.</w:t>
+        <w:t>Phiên bản 1.2.0  •  Lịch hẹn phân thợ và màu giao diện</w:t>
       </w:r>
     </w:p>
     <w:p>
@@ -25,27 +20,17 @@
         <w:pStyle w:val="Heading1"/>
       </w:pPr>
       <w:r>
-        <w:t>Nâng cấp từ phiên bản trước</w:t>
+        <w:t>Nâng cấp từ v1 1 0</w:t>
       </w:r>
     </w:p>
     <w:p>
       <w:r>
-        <w:t>Sao lưu database và giữ ZIP v1.0.0 trước khi nâng cấp. Dừng nhận giao dịch trong lúc cập nhật.</w:t>
+        <w:t>Sao lưu database và giữ ZIP hiện tại. Dừng nhận giao dịch trong lúc nâng cấp. Chạy một lần toàn bộ supabase/migrations/202610290004_appointments.sql trong SQL Editor của cùng project Supabase. Không reset database.</w:t>
       </w:r>
     </w:p>
     <w:p>
       <w:r>
-        <w:t>Supabase SQL Editor: chạy toàn bộ supabase/migrations/202610290003_reconciliation.sql một lần. Không chạy lại foundation hoặc reset database.</w:t>
-      </w:r>
-    </w:p>
-    <w:p>
-      <w:r>
-        <w:t>Giữ biến môi trường Supabase hiện tại trên Vercel. Thay source, chạy npm ci rồi npm run build, commit/push để deploy. Node 24, Next.js preset, output mặc định.</w:t>
-      </w:r>
-    </w:p>
-    <w:p>
-      <w:r>
-        <w:t>Đăng nhập tài khoản cũ. Chọn Ca thu ngân và đối soát. Giao dịch cũ không có ca nhưng vẫn được tính trong báo cáo thu ròng.</w:t>
+        <w:t>Giữ nguyên biến môi trường, tài khoản và dữ liệu. Cập nhật source, chạy npm ci và npm run build, deploy lại Vercel. Nếu cài mới, chạy migrations theo thứ tự foundation → counter → reconciliation → appointments; cấu hình Auth và môi trường theo README.</w:t>
       </w:r>
     </w:p>
     <w:p>
@@ -53,32 +38,17 @@
         <w:pStyle w:val="Heading1"/>
       </w:pPr>
       <w:r>
-        <w:t>Mở và đóng ca</w:t>
+        <w:t>Khai báo thợ và màu giao diện</w:t>
       </w:r>
     </w:p>
     <w:p>
       <w:r>
-        <w:t>Mỗi tài khoản chỉ có một ca đang mở. Nhập số tiền mặt đầu ca rồi chọn Mở ca. Không dùng chung tài khoản giữa các thu ngân.</w:t>
+        <w:t>Chủ salon mở mục Lịch hẹn và màu giao diện. Nhập tên thợ để thêm người nhận lịch. Có thể chuyển thợ sang ngừng nhận lịch, vẫn giữ lịch sử cũ. Nhân viên thực hiện là danh mục riêng, không tự tạo tài khoản đăng nhập.</w:t>
       </w:r>
     </w:p>
     <w:p>
       <w:r>
-        <w:t>Tạo khách, đơn và thanh toán như phiên bản trước. Database tự gắn payment vào ca của người thu. Chưa mở ca thì không thu tiền được.</w:t>
-      </w:r>
-    </w:p>
-    <w:p>
-      <w:r>
-        <w:t>Cuối ca kiểm đếm tiền mặt, nhập số tiền và ghi chú. Nếu lệch dự kiến, bắt buộc nhập lý do ít nhất 3 ký tự. Chọn Xác nhận đóng ca.</w:t>
-      </w:r>
-    </w:p>
-    <w:p>
-      <w:r>
-        <w:t>Dự kiến = tiền đầu ca + khoản thu tiền mặt trong ca − hoàn tiền mặt thực hiện trong ca. Chuyển khoản không cộng vào két. Bản này chưa có nghiệp vụ rút/nộp tiền giữa ca.</w:t>
-      </w:r>
-    </w:p>
-    <w:p>
-      <w:r>
-        <w:t>Ca đóng giữ nguyên kết quả. Mở ca mới để tiếp tục thu. Chủ salon xem các ca trong salon; thu ngân chỉ xem ca của mình.</w:t>
+        <w:t>Chọn Màu chủ đạo rồi Lưu màu cho salon. Màu được lưu trên Supabase và dùng trong các trang vận hành của salon, áp dụng cho mọi tài khoản. Nút tự chọn chữ đen hoặc trắng để dễ đọc. Thu ngân không có quyền đổi màu hoặc khai báo thợ.</w:t>
       </w:r>
     </w:p>
     <w:p>
@@ -86,32 +56,27 @@
         <w:pStyle w:val="Heading1"/>
       </w:pPr>
       <w:r>
-        <w:t>Hoàn tiền</w:t>
+        <w:t>Đặt và sửa lịch</w:t>
       </w:r>
     </w:p>
     <w:p>
       <w:r>
-        <w:t>Chỉ chủ salon được hoàn tiền và cần mở ca của chính mình. Có thể hoàn một phần hoặc nhiều lần, tổng không vượt khoản đã thu.</w:t>
+        <w:t>Tạo hồ sơ khách tại mục Khách hàng trước. Trong lịch hẹn chọn khách, thợ đang hoạt động, giờ bắt đầu/kết thúc và dịch vụ. Thời gian hiển thị theo Việt Nam UTC+7, mỗi lịch không quá 24 giờ.</w:t>
       </w:r>
     </w:p>
     <w:p>
       <w:r>
-        <w:t>Chọn khoản thu trong 100 khoản gần nhất trên biểu mẫu hoàn tiền. Kiểm tra khách, đơn và số tiền, sau đó nhập số tiền hoàn và lý do. Khoản thu xa hơn cần tra cứu trước khi xử lý.</w:t>
+        <w:t>Ô dịch vụ cho chọn nhiều bằng Ctrl trên máy tính hoặc chọn nhiều theo cách trình duyệt thiết bị hỗ trợ. Mỗi dịch vụ có số lượng 1; có thể điều chỉnh số lượng sau khi tạo đơn. Nhập ghi chú rồi Lưu lịch hẹn.</w:t>
       </w:r>
     </w:p>
     <w:p>
       <w:r>
-        <w:t>Trả tiền thực tế cho khách theo phương thức thu ban đầu, sau đó tick xác nhận và ghi nhận hoàn tiền. App không tự chuyển khoản ngân hàng.</w:t>
+        <w:t>Database kiểm tra lịch chồng giờ của cùng một thợ. Hai lịch nối tiếp sát giờ được chấp nhận. Khi trùng, hệ thống từ chối và báo cảnh báo; nếu vẫn muốn đặt, tích Cho phép trùng giờ và nhập lý do ít nhất 3 ký tự rồi lưu lại. Thao tác và lý do được ghi nhật ký.</w:t>
       </w:r>
     </w:p>
     <w:p>
       <w:r>
-        <w:t>Phiếu thu và đơn gốc giữ nguyên, khoản hoàn ghi riêng. Hoàn sau khi ca gốc đã đóng được ghi vào ca hiện tại, không sửa kết quả ca cũ.</w:t>
-      </w:r>
-    </w:p>
-    <w:p>
-      <w:r>
-        <w:t>Nếu mất mạng sau xác nhận, tải lại kiểm tra refunds/nhật ký trước khi thực hiện lần nữa.</w:t>
+        <w:t>Sửa lịch trước khi chuyển thành đơn. Hệ thống kiểm tra lại trùng lịch và phiên bản dữ liệu để tránh ghi đè thay đổi từ máy khác.</w:t>
       </w:r>
     </w:p>
     <w:p>
@@ -119,27 +84,27 @@
         <w:pStyle w:val="Heading1"/>
       </w:pPr>
       <w:r>
-        <w:t>Báo cáo và lịch sử</w:t>
+        <w:t>Khách đến và tạo đơn</w:t>
       </w:r>
     </w:p>
     <w:p>
       <w:r>
-        <w:t>Chọn ngày bắt đầu và kết thúc trong mục Báo cáo thu ròng, tối đa 366 ngày. Thời gian tính theo Việt Nam.</w:t>
+        <w:t>Xác nhận lịch khi đã liên hệ khách. Khi khách đến, chọn Khách đến và tạo đơn. Hệ thống tạo một đơn phục vụ từ khách và dịch vụ đã chọn, giờ vào lấy thời điểm thực tế hiện tại.</w:t>
       </w:r>
     </w:p>
     <w:p>
       <w:r>
-        <w:t>Thu tính theo ngày nhận tiền; hoàn tính theo ngày trả tiền. Thu ròng = thu − hoàn. Kỳ hoàn có thể âm khi tiền thu thuộc kỳ trước.</w:t>
+        <w:t>Mỗi lịch chỉ tạo một đơn. Bấm lại sau mất kết nối không sinh đơn thứ hai. Mở mục Đơn hàng để kiểm tra, sửa dịch vụ, thanh toán và in phiếu. Đơn giá lấy bảng giá hiện hành khi chuyển hẹn thành đơn.</w:t>
       </w:r>
     </w:p>
     <w:p>
       <w:r>
-        <w:t>Báo cáo doanh thu 5 kỳ của v1.0.0 vẫn là thu trước hoàn; dùng báo cáo thu ròng để đối soát sau hoàn.</w:t>
+        <w:t>Mở ca trước khi thanh toán. Hoàn thành lịch sau khi đơn đã thanh toán; hệ thống chặn hoàn thành khi chưa thu tiền. Lịch chưa chuyển thành đơn có thể hủy hoặc đánh dấu không đến.</w:t>
       </w:r>
     </w:p>
     <w:p>
       <w:r>
-        <w:t>Danh sách hiển thị 100 ca gần nhất theo quyền; chủ salon thấy 100 thao tác gần nhất, gồm người thao tác, thời gian, mã và chi tiết. Xem lịch sử xa hơn trong database.</w:t>
+        <w:t>Danh sách hiển thị 200 lịch gần nhất theo giờ bắt đầu, lọc khách/thợ/trạng thái trong danh sách đó. Các ô lựa chọn khách/dịch vụ tối đa 1000 dòng. Đây chưa phải lịch tháng kéo thả hoặc hệ thống nhắc SMS/Zalo.</w:t>
       </w:r>
     </w:p>
     <w:p>
@@ -147,32 +112,17 @@
         <w:pStyle w:val="Heading1"/>
       </w:pPr>
       <w:r>
-        <w:t>Cấu hình mới và kiểm tra</w:t>
+        <w:t>Ca thu ngân và hoàn tiền</w:t>
       </w:r>
     </w:p>
     <w:p>
       <w:r>
-        <w:t>Cài mới: làm các bước Supabase, Auth, env và Vercel trong README.md; chạy các migration theo thứ tự foundation, counter, reconciliation.</w:t>
+        <w:t>Các tính năng v1.1.0 được giữ: mỗi tài khoản mở một ca, ghi tiền đầu ca, thu tiền và đóng ca bằng số tiền kiểm đếm. Tiền dự kiến = đầu ca + thu tiền mặt − hoàn tiền mặt trong ca. Chênh lệch cần lý do.</w:t>
       </w:r>
     </w:p>
     <w:p>
       <w:r>
-        <w:t>Không dùng service_role hoặc database password trong NEXT_PUBLIC. Không tắt RLS để xử lý lỗi.</w:t>
-      </w:r>
-    </w:p>
-    <w:p>
-      <w:r>
-        <w:t>Thử trên database thử: mở ca 100000, thu tiền mặt 200000, hoàn 50000, kiểm đếm 250000 thì chênh lệch bằng 0.</w:t>
-      </w:r>
-    </w:p>
-    <w:p>
-      <w:r>
-        <w:t>Thử thu khi chưa mở ca, cashier hoàn tiền, hoàn quá khoản thu và đóng ca lệch không có lý do: đều phải bị chặn.</w:t>
-      </w:r>
-    </w:p>
-    <w:p>
-      <w:r>
-        <w:t>Source chưa deploy lên tài khoản của Sếp; cần nghiệm thu trên Supabase hosted và máy in thật. Vercel Hobby dành cho phi thương mại theo hướng dẫn gói trước.</w:t>
+        <w:t>Chủ salon có thể ghi nhận hoàn từng phần sau khi đã trả tiền thực tế cho khách. Tổng hoàn không vượt khoản đã thu; app không tự chuyển tiền ngân hàng. Báo cáo thu ròng tính theo thời điểm nhận và hoàn tiền.</w:t>
       </w:r>
     </w:p>
     <w:p>
@@ -180,12 +130,35 @@
         <w:pStyle w:val="Heading1"/>
       </w:pPr>
       <w:r>
-        <w:t>Phiên bản tiếp theo</w:t>
+        <w:t>Kiểm tra trước khi vận hành</w:t>
       </w:r>
     </w:p>
     <w:p>
       <w:r>
-        <w:t>v1.2.0 dự kiến bổ sung lịch hẹn, phân thợ và chuyển hẹn thành đơn. Gửi ZIP mới nhất khi cần nâng cấp.</w:t>
+        <w:t>Trên project thử: đặt hai lịch cùng thợ chồng giờ phải bị chặn; xác nhận cho phép trùng và có lý do thì lưu được. Đặt cùng giờ cho hai thợ khác nhau không bị chặn.</w:t>
+      </w:r>
+    </w:p>
+    <w:p>
+      <w:r>
+        <w:t>Chuyển một lịch thành đơn hai lần phải chỉ có một đơn; tài khoản thu ngân không đổi được màu hoặc sửa danh mục thợ. Đổi màu, tải lại và đăng nhập tài khoản khác để kiểm tra màu dùng chung.</w:t>
+      </w:r>
+    </w:p>
+    <w:p>
+      <w:r>
+        <w:t>Source chưa được deploy hoặc nghiệm thu end to end trên tài khoản Supabase của Sếp. Kiểm tra máy in và PWA trên thiết bị thật trước vận hành. Phiếu thu không thay hóa đơn điện tử thuế.</w:t>
+      </w:r>
+    </w:p>
+    <w:p>
+      <w:pPr>
+        <w:pStyle w:val="Heading1"/>
+      </w:pPr>
+      <w:r>
+        <w:t>Phiên bản kế tiếp</w:t>
+      </w:r>
+    </w:p>
+    <w:p>
+      <w:r>
+        <w:t>v1.3.0 dự kiến bổ sung nháp offline và xử lý đồng bộ; không thu tiền offline. Gửi ZIP mới nhất khi cần xây dựng tiếp.</w:t>
       </w:r>
     </w:p>
     <w:sectPr>
@@ -562,7 +535,7 @@
     <w:qFormat/>
     <w:rsid w:val="00FC693F"/>
     <w:pPr>
-      <w:spacing w:after="120" w:line="252" w:lineRule="auto"/>
+      <w:spacing w:after="140"/>
     </w:pPr>
     <w:rPr>
       <w:rFonts w:ascii="Arial" w:hAnsi="Arial"/>
@@ -624,7 +597,7 @@
     <w:pPr>
       <w:keepNext/>
       <w:keepLines/>
-      <w:spacing w:before="240" w:after="0"/>
+      <w:spacing w:before="480" w:after="0"/>
       <w:outlineLvl w:val="0"/>
     </w:pPr>
     <w:rPr>
@@ -655,7 +628,7 @@
       <w:rFonts w:asciiTheme="majorHAnsi" w:eastAsiaTheme="majorEastAsia" w:hAnsiTheme="majorHAnsi" w:cstheme="majorBidi"/>
       <w:b/>
       <w:bCs/>
-      <w:color w:val="000000"/>
+      <w:color w:val="4F81BD" w:themeColor="accent1"/>
       <w:sz w:val="26"/>
       <w:szCs w:val="26"/>
     </w:rPr>

</xml_diff>

<commit_message>
V1.2.1 sửa lại bản 2.0
</commit_message>
<xml_diff>
--- a/HUONG_DAN_SU_DUNG.docx
+++ b/HUONG_DAN_SU_DUNG.docx
@@ -12,7 +12,7 @@
     </w:p>
     <w:p>
       <w:r>
-        <w:t>Phiên bản 1.2.0  •  Lịch hẹn phân thợ và màu giao diện</w:t>
+        <w:t>Phiên bản 1.2.1  •  Cài đặt giao diện toàn hệ thống</w:t>
       </w:r>
     </w:p>
     <w:p>
@@ -20,17 +20,17 @@
         <w:pStyle w:val="Heading1"/>
       </w:pPr>
       <w:r>
-        <w:t>Nâng cấp từ v1 1 0</w:t>
+        <w:t>Nâng cấp từ v1 2 0</w:t>
       </w:r>
     </w:p>
     <w:p>
       <w:r>
-        <w:t>Sao lưu database và giữ ZIP hiện tại. Dừng nhận giao dịch trong lúc nâng cấp. Chạy một lần toàn bộ supabase/migrations/202610290004_appointments.sql trong SQL Editor của cùng project Supabase. Không reset database.</w:t>
+        <w:t>Sao lưu database và giữ ZIP hiện tại. Dừng nhận giao dịch trong lúc nâng cấp. Chạy một lần toàn bộ supabase/migrations/202610290005_appearance.sql trong SQL Editor của cùng project Supabase. Không reset database.</w:t>
       </w:r>
     </w:p>
     <w:p>
       <w:r>
-        <w:t>Giữ nguyên biến môi trường, tài khoản và dữ liệu. Cập nhật source, chạy npm ci và npm run build, deploy lại Vercel. Nếu cài mới, chạy migrations theo thứ tự foundation → counter → reconciliation → appointments; cấu hình Auth và môi trường theo README.</w:t>
+        <w:t>Giữ nguyên biến môi trường, tài khoản và dữ liệu. Cập nhật source, chạy npm ci và npm run build, deploy lại Vercel. Nếu cài mới, chạy migrations theo thứ tự foundation → counter → reconciliation → appointments → appearance; cấu hình Auth và môi trường theo README.</w:t>
       </w:r>
     </w:p>
     <w:p>
@@ -38,17 +38,17 @@
         <w:pStyle w:val="Heading1"/>
       </w:pPr>
       <w:r>
-        <w:t>Khai báo thợ và màu giao diện</w:t>
+        <w:t>Tùy chỉnh giao diện trong Cài đặt</w:t>
       </w:r>
     </w:p>
     <w:p>
       <w:r>
-        <w:t>Chủ salon mở mục Lịch hẹn và màu giao diện. Nhập tên thợ để thêm người nhận lịch. Có thể chuyển thợ sang ngừng nhận lịch, vẫn giữ lịch sử cũ. Nhân viên thực hiện là danh mục riêng, không tự tạo tài khoản đăng nhập.</w:t>
+        <w:t>Chủ salon mở Cài đặt → Tùy chỉnh giao diện. Tính năng này đã được chuyển ra khỏi Lịch hẹn. Bảng cấu hình gồm màu sidebar, gradient, màu nền toàn trang, màu nền thẻ và màu nút điểm nhấn. Danh mục thợ vẫn quản lý tại Lịch hẹn và phân thợ.</w:t>
       </w:r>
     </w:p>
     <w:p>
       <w:r>
-        <w:t>Chọn Màu chủ đạo rồi Lưu màu cho salon. Màu được lưu trên Supabase và dùng trong các trang vận hành của salon, áp dụng cho mọi tài khoản. Nút tự chọn chữ đen hoặc trắng để dễ đọc. Thu ngân không có quyền đổi màu hoặc khai báo thợ.</w:t>
+        <w:t>Bấm màu mẫu hoặc chọn màu tùy ý, nhập mã HEX dạng #3479ca. Bật Gradient sidebar và chọn màu đầu/cuối nếu muốn chuyển màu. Mỗi thay đổi xem trước ngay trên các thành phần trang web. Chọn hai màu gradient có độ sáng tương tự để chữ dễ đọc. Bấm Lưu giao diện để lưu chung cho salon. Hủy thay đổi trả về cấu hình đã lưu; Khôi phục mặc định chỉ xem trước, cần bấm Lưu để xác nhận. Màu áp dụng sau đăng nhập, không đổi phiếu in nền trắng. Thu ngân chỉ xem, chủ salon được lưu. Nếu nâng từ v1.1.0, chạy migration appointments trước migration appearance.</w:t>
       </w:r>
     </w:p>
     <w:p>
@@ -140,7 +140,7 @@
     </w:p>
     <w:p>
       <w:r>
-        <w:t>Chuyển một lịch thành đơn hai lần phải chỉ có một đơn; tài khoản thu ngân không đổi được màu hoặc sửa danh mục thợ. Đổi màu, tải lại và đăng nhập tài khoản khác để kiểm tra màu dùng chung.</w:t>
+        <w:t>Chuyển một lịch thành đơn hai lần phải chỉ có một đơn; tài khoản thu ngân không đổi được màu hoặc sửa danh mục thợ. Trong Cài đặt, thử màu sidebar, gradient, nền trang và nền thẻ; bấm Hủy để kiểm tra khôi phục. Lưu, tải lại và đăng nhập tài khoản khác để kiểm tra màu dùng chung.</w:t>
       </w:r>
     </w:p>
     <w:p>

</xml_diff>